<commit_message>
Improve resume pipeline, Gemini support, and env-based overrides.
Parse narrative CV sections and job blocks with continuation lines; fall back cleanly for legacy TITLE or bullet-only experience. Add Gemini to the AI module with clearer network errors, stricter CV prompts, and profile mapping for jobs, tooling, and education. Add USE_FIXED_CONTACT and USE_FIXED_FEATURED_PROJECT so contact links and the MegaPlug Play Store URL come from .env. Document variables in .env.example; refresh data inputs and sample DOCX/PDF output.

Made-with: Cursor
</commit_message>
<xml_diff>
--- a/out/michael_samuel_cv.docx
+++ b/out/michael_samuel_cv.docx
@@ -15,7 +15,7 @@
           <w:sz w:val="48"/>
           <w:szCs w:val="48"/>
         </w:rPr>
-        <w:t xml:space="preserve">Michael Samuel</w:t>
+        <w:t xml:space="preserve">Michael Samuel Naeem</w:t>
       </w:r>
     </w:p>
     <w:p>
@@ -31,8 +31,81 @@
           <w:sz w:val="22"/>
           <w:szCs w:val="22"/>
         </w:rPr>
-        <w:t xml:space="preserve">Mobile Developer</w:t>
-      </w:r>
+        <w:t xml:space="preserve">Senior Android Engineer | Mobile Architecture &amp; Real-time Systems</w:t>
+      </w:r>
+    </w:p>
+    <w:p>
+      <w:pPr>
+        <w:spacing w:after="30"/>
+      </w:pPr>
+      <w:r>
+        <w:rPr>
+          <w:rFonts w:ascii="Arial" w:cs="Arial" w:eastAsia="Arial" w:hAnsi="Arial"/>
+          <w:color w:val="555555"/>
+          <w:sz w:val="18"/>
+          <w:szCs w:val="18"/>
+        </w:rPr>
+        <w:t xml:space="preserve">+201098002198 · michaelsam00@yahoo.com</w:t>
+      </w:r>
+    </w:p>
+    <w:p>
+      <w:pPr>
+        <w:spacing w:after="10"/>
+      </w:pPr>
+      <w:hyperlink w:history="1" r:id="rIdbvjk83uog7c47rpagwgjr">
+        <w:r>
+          <w:rPr>
+            <w:rFonts w:ascii="Arial" w:cs="Arial" w:eastAsia="Arial" w:hAnsi="Arial"/>
+            <w:color w:val="1A5276"/>
+            <w:sz w:val="18"/>
+            <w:szCs w:val="18"/>
+            <w:u w:val="single"/>
+          </w:rPr>
+          <w:t xml:space="preserve">Portfolio</w:t>
+        </w:r>
+      </w:hyperlink>
+      <w:r>
+        <w:rPr>
+          <w:rFonts w:ascii="Arial" w:cs="Arial" w:eastAsia="Arial" w:hAnsi="Arial"/>
+          <w:color w:val="555555"/>
+          <w:sz w:val="18"/>
+          <w:szCs w:val="18"/>
+        </w:rPr>
+        <w:t xml:space="preserve">  ·  </w:t>
+      </w:r>
+      <w:hyperlink w:history="1" r:id="rIdgjlzafqw-j75xxkdw1u0m">
+        <w:r>
+          <w:rPr>
+            <w:rFonts w:ascii="Arial" w:cs="Arial" w:eastAsia="Arial" w:hAnsi="Arial"/>
+            <w:color w:val="1A5276"/>
+            <w:sz w:val="18"/>
+            <w:szCs w:val="18"/>
+            <w:u w:val="single"/>
+          </w:rPr>
+          <w:t xml:space="preserve">LinkedIn</w:t>
+        </w:r>
+      </w:hyperlink>
+      <w:r>
+        <w:rPr>
+          <w:rFonts w:ascii="Arial" w:cs="Arial" w:eastAsia="Arial" w:hAnsi="Arial"/>
+          <w:color w:val="555555"/>
+          <w:sz w:val="18"/>
+          <w:szCs w:val="18"/>
+        </w:rPr>
+        <w:t xml:space="preserve">  ·  </w:t>
+      </w:r>
+      <w:hyperlink w:history="1" r:id="rIdstp3eezxa3hl3f0wmhbnz">
+        <w:r>
+          <w:rPr>
+            <w:rFonts w:ascii="Arial" w:cs="Arial" w:eastAsia="Arial" w:hAnsi="Arial"/>
+            <w:color w:val="1A5276"/>
+            <w:sz w:val="18"/>
+            <w:szCs w:val="18"/>
+            <w:u w:val="single"/>
+          </w:rPr>
+          <w:t xml:space="preserve">GitHub</w:t>
+        </w:r>
+      </w:hyperlink>
     </w:p>
     <w:p>
       <w:pPr>
@@ -77,7 +150,7 @@
           <w:sz w:val="19"/>
           <w:szCs w:val="19"/>
         </w:rPr>
-        <w:t xml:space="preserve">Experienced mobile engineer focused on shipping reliable iOS and Android apps with measurable quality improvements, strong collaboration with product and design, and disciplined release practices.</w:t>
+        <w:t xml:space="preserve">Senior Android Engineer with 10+ years of experience building production applications across fintech, marketplace, and IoT domains. Expert in scalable mobile architecture, real-time features, and cross-stack coordination. Proven track record of leading technical decisions, mentoring teams, and delivering high-performance systems under real-world constraints.</w:t>
       </w:r>
     </w:p>
     <w:p>
@@ -104,7 +177,7 @@
           <w:sz w:val="19"/>
           <w:szCs w:val="19"/>
         </w:rPr>
-        <w:t xml:space="preserve">Emphasis for this opportunity: Swift, Kotlin, Firebase, REST APIs — aligned with language in the job description. Experience bullets are ordered with the strongest textual match to the description first.</w:t>
+        <w:t xml:space="preserve">Michael brings direct marketplace experience from building the Doworkss platform and fintech expertise from myFawry, aligning with n11's e-commerce focus. His deep proficiency in Java/Kotlin, Clean Architecture, and TDD ensures the delivery of robust, high-availability mobile services that integrate seamlessly with complex backend microservices.</w:t>
       </w:r>
     </w:p>
     <w:p>
@@ -144,16 +217,91 @@
           <w:sz w:val="19"/>
           <w:szCs w:val="19"/>
         </w:rPr>
-        <w:t xml:space="preserve">Skills: </w:t>
-      </w:r>
-      <w:r>
-        <w:rPr>
-          <w:rFonts w:ascii="Arial" w:cs="Arial" w:eastAsia="Arial" w:hAnsi="Arial"/>
-          <w:color w:val="111111"/>
-          <w:sz w:val="19"/>
-          <w:szCs w:val="19"/>
-        </w:rPr>
-        <w:t xml:space="preserve">Swift, Kotlin, Firebase, REST APIs, Git, CI basics, profiling, logging, App Store / Play Console</w:t>
+        <w:t xml:space="preserve">Android &amp; Mobile: </w:t>
+      </w:r>
+      <w:r>
+        <w:rPr>
+          <w:rFonts w:ascii="Arial" w:cs="Arial" w:eastAsia="Arial" w:hAnsi="Arial"/>
+          <w:color w:val="111111"/>
+          <w:sz w:val="19"/>
+          <w:szCs w:val="19"/>
+        </w:rPr>
+        <w:t xml:space="preserve">Kotlin, Java, Jetpack Compose, Android SDK, MVVM, Clean Architecture, Multi-module</w:t>
+      </w:r>
+    </w:p>
+    <w:p>
+      <w:pPr>
+        <w:spacing w:after="65"/>
+      </w:pPr>
+      <w:r>
+        <w:rPr>
+          <w:rFonts w:ascii="Arial" w:cs="Arial" w:eastAsia="Arial" w:hAnsi="Arial"/>
+          <w:b/>
+          <w:bCs/>
+          <w:color w:val="111111"/>
+          <w:sz w:val="19"/>
+          <w:szCs w:val="19"/>
+        </w:rPr>
+        <w:t xml:space="preserve">Architecture &amp; Patterns: </w:t>
+      </w:r>
+      <w:r>
+        <w:rPr>
+          <w:rFonts w:ascii="Arial" w:cs="Arial" w:eastAsia="Arial" w:hAnsi="Arial"/>
+          <w:color w:val="111111"/>
+          <w:sz w:val="19"/>
+          <w:szCs w:val="19"/>
+        </w:rPr>
+        <w:t xml:space="preserve">SOLID, Multi-module scaling, Design Patterns, DDD, ADR Framework</w:t>
+      </w:r>
+    </w:p>
+    <w:p>
+      <w:pPr>
+        <w:spacing w:after="65"/>
+      </w:pPr>
+      <w:r>
+        <w:rPr>
+          <w:rFonts w:ascii="Arial" w:cs="Arial" w:eastAsia="Arial" w:hAnsi="Arial"/>
+          <w:b/>
+          <w:bCs/>
+          <w:color w:val="111111"/>
+          <w:sz w:val="19"/>
+          <w:szCs w:val="19"/>
+        </w:rPr>
+        <w:t xml:space="preserve">Networking &amp; Real-time: </w:t>
+      </w:r>
+      <w:r>
+        <w:rPr>
+          <w:rFonts w:ascii="Arial" w:cs="Arial" w:eastAsia="Arial" w:hAnsi="Arial"/>
+          <w:color w:val="111111"/>
+          <w:sz w:val="19"/>
+          <w:szCs w:val="19"/>
+        </w:rPr>
+        <w:t xml:space="preserve">REST API, WebSocket, gRPC, Retrofit, OkHttp, WebRTC, Event-driven architecture</w:t>
+      </w:r>
+    </w:p>
+    <w:p>
+      <w:pPr>
+        <w:spacing w:after="65"/>
+      </w:pPr>
+      <w:r>
+        <w:rPr>
+          <w:rFonts w:ascii="Arial" w:cs="Arial" w:eastAsia="Arial" w:hAnsi="Arial"/>
+          <w:b/>
+          <w:bCs/>
+          <w:color w:val="111111"/>
+          <w:sz w:val="19"/>
+          <w:szCs w:val="19"/>
+        </w:rPr>
+        <w:t xml:space="preserve">Quality &amp; DevOps: </w:t>
+      </w:r>
+      <w:r>
+        <w:rPr>
+          <w:rFonts w:ascii="Arial" w:cs="Arial" w:eastAsia="Arial" w:hAnsi="Arial"/>
+          <w:color w:val="111111"/>
+          <w:sz w:val="19"/>
+          <w:szCs w:val="19"/>
+        </w:rPr>
+        <w:t xml:space="preserve">TDD, JUnit, Mockito, Espresso, CI/CD, Jenkins, Firebase, Git</w:t>
       </w:r>
     </w:p>
     <w:p>
@@ -177,7 +325,7 @@
           <w:sz w:val="20"/>
           <w:szCs w:val="20"/>
         </w:rPr>
-        <w:t xml:space="preserve">PROFESSIONAL EXPERIENCE</w:t>
+        <w:t xml:space="preserve">FEATURED PROJECT</w:t>
       </w:r>
     </w:p>
     <w:p>
@@ -190,6 +338,72 @@
     </w:p>
     <w:p>
       <w:pPr>
+        <w:spacing w:after="40"/>
+      </w:pPr>
+      <w:r>
+        <w:rPr>
+          <w:rFonts w:ascii="Arial" w:cs="Arial" w:eastAsia="Arial" w:hAnsi="Arial"/>
+          <w:b/>
+          <w:bCs/>
+          <w:color w:val="111111"/>
+          <w:sz w:val="19"/>
+          <w:szCs w:val="19"/>
+        </w:rPr>
+        <w:t xml:space="preserve">MegaPlug — EV Charging Management Platform  ·  </w:t>
+      </w:r>
+      <w:hyperlink w:history="1" r:id="rIdyaeqigyqzrz2-apagsrek">
+        <w:r>
+          <w:rPr>
+            <w:rFonts w:ascii="Arial" w:cs="Arial" w:eastAsia="Arial" w:hAnsi="Arial"/>
+            <w:color w:val="1A5276"/>
+            <w:sz w:val="19"/>
+            <w:szCs w:val="19"/>
+            <w:u w:val="single"/>
+          </w:rPr>
+          <w:t xml:space="preserve">Google Play</w:t>
+        </w:r>
+      </w:hyperlink>
+    </w:p>
+    <w:p>
+      <w:pPr>
+        <w:spacing w:after="60"/>
+      </w:pPr>
+      <w:r>
+        <w:rPr>
+          <w:rFonts w:ascii="Arial" w:cs="Arial" w:eastAsia="Arial" w:hAnsi="Arial"/>
+          <w:color w:val="111111"/>
+          <w:sz w:val="19"/>
+          <w:szCs w:val="19"/>
+        </w:rPr>
+        <w:t xml:space="preserve">Production Android app for real-time EV charging monitoring. Solved challenges in reliable OCPP v1.6 communication over unstable 4G via offline command queueing and real-time UI synchronization with physical hardware.</w:t>
+      </w:r>
+    </w:p>
+    <w:p>
+      <w:pPr>
+        <w:spacing w:after="60" w:before="200"/>
+      </w:pPr>
+      <w:r>
+        <w:rPr>
+          <w:rFonts w:ascii="Arial" w:cs="Arial" w:eastAsia="Arial" w:hAnsi="Arial"/>
+          <w:b/>
+          <w:bCs/>
+          <w:color w:val="1A5276"/>
+          <w:sz w:val="20"/>
+          <w:szCs w:val="20"/>
+        </w:rPr>
+        <w:t xml:space="preserve">PROFESSIONAL EXPERIENCE</w:t>
+      </w:r>
+    </w:p>
+    <w:p>
+      <w:pPr>
+        <w:pBdr>
+          <w:bottom w:val="single" w:color="AAAAAA" w:sz="4" w:space="1"/>
+        </w:pBdr>
+        <w:spacing w:after="80" w:before="80"/>
+      </w:pPr>
+    </w:p>
+    <w:p>
+      <w:pPr>
         <w:tabs>
           <w:tab w:val="right" w:pos="9360"/>
         </w:tabs>
@@ -204,7 +418,7 @@
           <w:sz w:val="20"/>
           <w:szCs w:val="20"/>
         </w:rPr>
-        <w:t xml:space="preserve">Experience</w:t>
+        <w:t xml:space="preserve">Android Tech Lead</w:t>
       </w:r>
       <w:r>
         <w:rPr>
@@ -213,7 +427,7 @@
           <w:sz w:val="18"/>
           <w:szCs w:val="18"/>
         </w:rPr>
-        <w:t xml:space="preserve">	</w:t>
+        <w:t xml:space="preserve">	Jun 2024 – Present</w:t>
       </w:r>
     </w:p>
     <w:p>
@@ -229,83 +443,173 @@
           <w:sz w:val="18"/>
           <w:szCs w:val="18"/>
         </w:rPr>
+        <w:t xml:space="preserve">Tadafuq</w:t>
+      </w:r>
+    </w:p>
+    <w:p>
+      <w:pPr>
+        <w:pStyle w:val="ListParagraph"/>
+        <w:numPr>
+          <w:ilvl w:val="0"/>
+          <w:numId w:val="2"/>
+        </w:numPr>
+        <w:spacing w:after="70"/>
+      </w:pPr>
+      <w:r>
+        <w:rPr>
+          <w:rFonts w:ascii="Arial" w:cs="Arial" w:eastAsia="Arial" w:hAnsi="Arial"/>
+          <w:color w:val="111111"/>
+          <w:sz w:val="19"/>
+          <w:szCs w:val="19"/>
+        </w:rPr>
+        <w:t xml:space="preserve">Lead Android development and system integration for an EV Charging Management Platform, coordinating 6 engineers across mobile, backend, and IoT.</w:t>
+      </w:r>
+    </w:p>
+    <w:p>
+      <w:pPr>
+        <w:pStyle w:val="ListParagraph"/>
+        <w:numPr>
+          <w:ilvl w:val="0"/>
+          <w:numId w:val="2"/>
+        </w:numPr>
+        <w:spacing w:after="70"/>
+      </w:pPr>
+      <w:r>
+        <w:rPr>
+          <w:rFonts w:ascii="Arial" w:cs="Arial" w:eastAsia="Arial" w:hAnsi="Arial"/>
+          <w:color w:val="111111"/>
+          <w:sz w:val="19"/>
+          <w:szCs w:val="19"/>
+        </w:rPr>
+        <w:t xml:space="preserve">Introduced ADR framework and architecture standards across 3 product lines, reducing integration issues by 40% through standardized service contracts.</w:t>
+      </w:r>
+    </w:p>
+    <w:p>
+      <w:pPr>
+        <w:pStyle w:val="ListParagraph"/>
+        <w:numPr>
+          <w:ilvl w:val="0"/>
+          <w:numId w:val="2"/>
+        </w:numPr>
+        <w:spacing w:after="70"/>
+      </w:pPr>
+      <w:r>
+        <w:rPr>
+          <w:rFonts w:ascii="Arial" w:cs="Arial" w:eastAsia="Arial" w:hAnsi="Arial"/>
+          <w:color w:val="111111"/>
+          <w:sz w:val="19"/>
+          <w:szCs w:val="19"/>
+        </w:rPr>
+        <w:t xml:space="preserve">Designed offline retry queues for charging session management to handle 4G connection drops, utilizing OCPP over MQTT for superior lifecycle support.</w:t>
+      </w:r>
+    </w:p>
+    <w:p>
+      <w:pPr>
+        <w:spacing w:after="50"/>
+      </w:pPr>
+      <w:r>
         <w:t xml:space="preserve"/>
       </w:r>
     </w:p>
     <w:p>
       <w:pPr>
-        <w:pStyle w:val="ListParagraph"/>
-        <w:numPr>
-          <w:ilvl w:val="0"/>
-          <w:numId w:val="2"/>
-        </w:numPr>
-        <w:spacing w:after="70"/>
-      </w:pPr>
-      <w:r>
-        <w:rPr>
-          <w:rFonts w:ascii="Arial" w:cs="Arial" w:eastAsia="Arial" w:hAnsi="Arial"/>
-          <w:color w:val="111111"/>
-          <w:sz w:val="19"/>
-          <w:szCs w:val="19"/>
-        </w:rPr>
-        <w:t xml:space="preserve">Owned feature delivery end-to-end: requirements, implementation, release, and post-release monitoring.</w:t>
-      </w:r>
-    </w:p>
-    <w:p>
-      <w:pPr>
-        <w:pStyle w:val="ListParagraph"/>
-        <w:numPr>
-          <w:ilvl w:val="0"/>
-          <w:numId w:val="2"/>
-        </w:numPr>
-        <w:spacing w:after="70"/>
-      </w:pPr>
-      <w:r>
-        <w:rPr>
-          <w:rFonts w:ascii="Arial" w:cs="Arial" w:eastAsia="Arial" w:hAnsi="Arial"/>
-          <w:color w:val="111111"/>
-          <w:sz w:val="19"/>
-          <w:szCs w:val="19"/>
-        </w:rPr>
-        <w:t xml:space="preserve">Reduced crashes and latency using profiling, structured logging, feature flags, and careful rollout.</w:t>
-      </w:r>
-    </w:p>
-    <w:p>
-      <w:pPr>
-        <w:pStyle w:val="ListParagraph"/>
-        <w:numPr>
-          <w:ilvl w:val="0"/>
-          <w:numId w:val="2"/>
-        </w:numPr>
-        <w:spacing w:after="70"/>
-      </w:pPr>
-      <w:r>
-        <w:rPr>
-          <w:rFonts w:ascii="Arial" w:cs="Arial" w:eastAsia="Arial" w:hAnsi="Arial"/>
-          <w:color w:val="111111"/>
-          <w:sz w:val="19"/>
-          <w:szCs w:val="19"/>
-        </w:rPr>
-        <w:t xml:space="preserve">Partnered with backend teams on REST contracts, error handling, and performance-sensitive mobile flows.</w:t>
-      </w:r>
-    </w:p>
-    <w:p>
-      <w:pPr>
-        <w:pStyle w:val="ListParagraph"/>
-        <w:numPr>
-          <w:ilvl w:val="0"/>
-          <w:numId w:val="2"/>
-        </w:numPr>
-        <w:spacing w:after="70"/>
-      </w:pPr>
-      <w:r>
-        <w:rPr>
-          <w:rFonts w:ascii="Arial" w:cs="Arial" w:eastAsia="Arial" w:hAnsi="Arial"/>
-          <w:color w:val="111111"/>
-          <w:sz w:val="19"/>
-          <w:szCs w:val="19"/>
-        </w:rPr>
-        <w:t xml:space="preserve">Mentored junior developers on code review, testing habits, and release hygiene.</w:t>
+        <w:tabs>
+          <w:tab w:val="right" w:pos="9360"/>
+        </w:tabs>
+        <w:spacing w:after="10" w:before="180"/>
+      </w:pPr>
+      <w:r>
+        <w:rPr>
+          <w:rFonts w:ascii="Arial" w:cs="Arial" w:eastAsia="Arial" w:hAnsi="Arial"/>
+          <w:b/>
+          <w:bCs/>
+          <w:color w:val="111111"/>
+          <w:sz w:val="20"/>
+          <w:szCs w:val="20"/>
+        </w:rPr>
+        <w:t xml:space="preserve">Senior Android Developer</w:t>
+      </w:r>
+      <w:r>
+        <w:rPr>
+          <w:rFonts w:ascii="Arial" w:cs="Arial" w:eastAsia="Arial" w:hAnsi="Arial"/>
+          <w:color w:val="555555"/>
+          <w:sz w:val="18"/>
+          <w:szCs w:val="18"/>
+        </w:rPr>
+        <w:t xml:space="preserve">	Jun 2023 – Jun 2024</w:t>
+      </w:r>
+    </w:p>
+    <w:p>
+      <w:pPr>
+        <w:spacing w:after="90"/>
+      </w:pPr>
+      <w:r>
+        <w:rPr>
+          <w:rFonts w:ascii="Arial" w:cs="Arial" w:eastAsia="Arial" w:hAnsi="Arial"/>
+          <w:i/>
+          <w:iCs/>
+          <w:color w:val="1A5276"/>
+          <w:sz w:val="18"/>
+          <w:szCs w:val="18"/>
+        </w:rPr>
+        <w:t xml:space="preserve">Communico</w:t>
+      </w:r>
+    </w:p>
+    <w:p>
+      <w:pPr>
+        <w:pStyle w:val="ListParagraph"/>
+        <w:numPr>
+          <w:ilvl w:val="0"/>
+          <w:numId w:val="2"/>
+        </w:numPr>
+        <w:spacing w:after="70"/>
+      </w:pPr>
+      <w:r>
+        <w:rPr>
+          <w:rFonts w:ascii="Arial" w:cs="Arial" w:eastAsia="Arial" w:hAnsi="Arial"/>
+          <w:color w:val="111111"/>
+          <w:sz w:val="19"/>
+          <w:szCs w:val="19"/>
+        </w:rPr>
+        <w:t xml:space="preserve">Developed Android platforms for humanoid robots (CRUZR, Pepper) at NEOM City, integrating GPT-4 intent recognition with STT pre-processing.</w:t>
+      </w:r>
+    </w:p>
+    <w:p>
+      <w:pPr>
+        <w:pStyle w:val="ListParagraph"/>
+        <w:numPr>
+          <w:ilvl w:val="0"/>
+          <w:numId w:val="2"/>
+        </w:numPr>
+        <w:spacing w:after="70"/>
+      </w:pPr>
+      <w:r>
+        <w:rPr>
+          <w:rFonts w:ascii="Arial" w:cs="Arial" w:eastAsia="Arial" w:hAnsi="Arial"/>
+          <w:color w:val="111111"/>
+          <w:sz w:val="19"/>
+          <w:szCs w:val="19"/>
+        </w:rPr>
+        <w:t xml:space="preserve">Reduced human fallback by 35% by tuning voice processing for noisy public environments.</w:t>
+      </w:r>
+    </w:p>
+    <w:p>
+      <w:pPr>
+        <w:pStyle w:val="ListParagraph"/>
+        <w:numPr>
+          <w:ilvl w:val="0"/>
+          <w:numId w:val="2"/>
+        </w:numPr>
+        <w:spacing w:after="70"/>
+      </w:pPr>
+      <w:r>
+        <w:rPr>
+          <w:rFonts w:ascii="Arial" w:cs="Arial" w:eastAsia="Arial" w:hAnsi="Arial"/>
+          <w:color w:val="111111"/>
+          <w:sz w:val="19"/>
+          <w:szCs w:val="19"/>
+        </w:rPr>
+        <w:t xml:space="preserve">Reverse-engineered and integrated 4+ undocumented robot SDKs, establishing production-ready integration patterns.</w:t>
       </w:r>
     </w:p>
     <w:p>
@@ -314,6 +618,652 @@
       </w:pPr>
       <w:r>
         <w:t xml:space="preserve"/>
+      </w:r>
+    </w:p>
+    <w:p>
+      <w:pPr>
+        <w:tabs>
+          <w:tab w:val="right" w:pos="9360"/>
+        </w:tabs>
+        <w:spacing w:after="10" w:before="180"/>
+      </w:pPr>
+      <w:r>
+        <w:rPr>
+          <w:rFonts w:ascii="Arial" w:cs="Arial" w:eastAsia="Arial" w:hAnsi="Arial"/>
+          <w:b/>
+          <w:bCs/>
+          <w:color w:val="111111"/>
+          <w:sz w:val="20"/>
+          <w:szCs w:val="20"/>
+        </w:rPr>
+        <w:t xml:space="preserve">Senior Android Developer</w:t>
+      </w:r>
+      <w:r>
+        <w:rPr>
+          <w:rFonts w:ascii="Arial" w:cs="Arial" w:eastAsia="Arial" w:hAnsi="Arial"/>
+          <w:color w:val="555555"/>
+          <w:sz w:val="18"/>
+          <w:szCs w:val="18"/>
+        </w:rPr>
+        <w:t xml:space="preserve">	Jun 2022 – Jun 2023</w:t>
+      </w:r>
+    </w:p>
+    <w:p>
+      <w:pPr>
+        <w:spacing w:after="90"/>
+      </w:pPr>
+      <w:r>
+        <w:rPr>
+          <w:rFonts w:ascii="Arial" w:cs="Arial" w:eastAsia="Arial" w:hAnsi="Arial"/>
+          <w:i/>
+          <w:iCs/>
+          <w:color w:val="1A5276"/>
+          <w:sz w:val="18"/>
+          <w:szCs w:val="18"/>
+        </w:rPr>
+        <w:t xml:space="preserve">Mazaady</w:t>
+      </w:r>
+    </w:p>
+    <w:p>
+      <w:pPr>
+        <w:pStyle w:val="ListParagraph"/>
+        <w:numPr>
+          <w:ilvl w:val="0"/>
+          <w:numId w:val="2"/>
+        </w:numPr>
+        <w:spacing w:after="70"/>
+      </w:pPr>
+      <w:r>
+        <w:rPr>
+          <w:rFonts w:ascii="Arial" w:cs="Arial" w:eastAsia="Arial" w:hAnsi="Arial"/>
+          <w:color w:val="111111"/>
+          <w:sz w:val="19"/>
+          <w:szCs w:val="19"/>
+        </w:rPr>
+        <w:t xml:space="preserve">Architected Doworkss, a 240+ category marketplace using Jetpack Compose and Clean Architecture, shipping the MVP in under 3 months.</w:t>
+      </w:r>
+    </w:p>
+    <w:p>
+      <w:pPr>
+        <w:pStyle w:val="ListParagraph"/>
+        <w:numPr>
+          <w:ilvl w:val="0"/>
+          <w:numId w:val="2"/>
+        </w:numPr>
+        <w:spacing w:after="70"/>
+      </w:pPr>
+      <w:r>
+        <w:rPr>
+          <w:rFonts w:ascii="Arial" w:cs="Arial" w:eastAsia="Arial" w:hAnsi="Arial"/>
+          <w:color w:val="111111"/>
+          <w:sz w:val="19"/>
+          <w:szCs w:val="19"/>
+        </w:rPr>
+        <w:t xml:space="preserve">Optimized a live auction app with 120k MAU, reducing ANR rates to &lt;0.1% by migrating legacy GlobalScope coroutines to lifecycle-scoped alternatives.</w:t>
+      </w:r>
+    </w:p>
+    <w:p>
+      <w:pPr>
+        <w:pStyle w:val="ListParagraph"/>
+        <w:numPr>
+          <w:ilvl w:val="0"/>
+          <w:numId w:val="2"/>
+        </w:numPr>
+        <w:spacing w:after="70"/>
+      </w:pPr>
+      <w:r>
+        <w:rPr>
+          <w:rFonts w:ascii="Arial" w:cs="Arial" w:eastAsia="Arial" w:hAnsi="Arial"/>
+          <w:color w:val="111111"/>
+          <w:sz w:val="19"/>
+          <w:szCs w:val="19"/>
+        </w:rPr>
+        <w:t xml:space="preserve">Managed technical debt and performance bottlenecks for high-concurrency marketplace traffic.</w:t>
+      </w:r>
+    </w:p>
+    <w:p>
+      <w:pPr>
+        <w:spacing w:after="50"/>
+      </w:pPr>
+      <w:r>
+        <w:t xml:space="preserve"/>
+      </w:r>
+    </w:p>
+    <w:p>
+      <w:pPr>
+        <w:tabs>
+          <w:tab w:val="right" w:pos="9360"/>
+        </w:tabs>
+        <w:spacing w:after="10" w:before="180"/>
+      </w:pPr>
+      <w:r>
+        <w:rPr>
+          <w:rFonts w:ascii="Arial" w:cs="Arial" w:eastAsia="Arial" w:hAnsi="Arial"/>
+          <w:b/>
+          <w:bCs/>
+          <w:color w:val="111111"/>
+          <w:sz w:val="20"/>
+          <w:szCs w:val="20"/>
+        </w:rPr>
+        <w:t xml:space="preserve">Senior Android Developer</w:t>
+      </w:r>
+      <w:r>
+        <w:rPr>
+          <w:rFonts w:ascii="Arial" w:cs="Arial" w:eastAsia="Arial" w:hAnsi="Arial"/>
+          <w:color w:val="555555"/>
+          <w:sz w:val="18"/>
+          <w:szCs w:val="18"/>
+        </w:rPr>
+        <w:t xml:space="preserve">	Sep 2020 – May 2022</w:t>
+      </w:r>
+    </w:p>
+    <w:p>
+      <w:pPr>
+        <w:spacing w:after="90"/>
+      </w:pPr>
+      <w:r>
+        <w:rPr>
+          <w:rFonts w:ascii="Arial" w:cs="Arial" w:eastAsia="Arial" w:hAnsi="Arial"/>
+          <w:i/>
+          <w:iCs/>
+          <w:color w:val="1A5276"/>
+          <w:sz w:val="18"/>
+          <w:szCs w:val="18"/>
+        </w:rPr>
+        <w:t xml:space="preserve">Rowaad</w:t>
+      </w:r>
+    </w:p>
+    <w:p>
+      <w:pPr>
+        <w:pStyle w:val="ListParagraph"/>
+        <w:numPr>
+          <w:ilvl w:val="0"/>
+          <w:numId w:val="2"/>
+        </w:numPr>
+        <w:spacing w:after="70"/>
+      </w:pPr>
+      <w:r>
+        <w:rPr>
+          <w:rFonts w:ascii="Arial" w:cs="Arial" w:eastAsia="Arial" w:hAnsi="Arial"/>
+          <w:color w:val="111111"/>
+          <w:sz w:val="19"/>
+          <w:szCs w:val="19"/>
+        </w:rPr>
+        <w:t xml:space="preserve">Led the migration of a 15+ module codebase to MVVM and Clean Architecture, reducing developer onboarding time from 3 weeks to 1 week.</w:t>
+      </w:r>
+    </w:p>
+    <w:p>
+      <w:pPr>
+        <w:pStyle w:val="ListParagraph"/>
+        <w:numPr>
+          <w:ilvl w:val="0"/>
+          <w:numId w:val="2"/>
+        </w:numPr>
+        <w:spacing w:after="70"/>
+      </w:pPr>
+      <w:r>
+        <w:rPr>
+          <w:rFonts w:ascii="Arial" w:cs="Arial" w:eastAsia="Arial" w:hAnsi="Arial"/>
+          <w:color w:val="111111"/>
+          <w:sz w:val="19"/>
+          <w:szCs w:val="19"/>
+        </w:rPr>
+        <w:t xml:space="preserve">Established PR review processes and TDD practices, achieving 70% unit test coverage on core business logic.</w:t>
+      </w:r>
+    </w:p>
+    <w:p>
+      <w:pPr>
+        <w:pStyle w:val="ListParagraph"/>
+        <w:numPr>
+          <w:ilvl w:val="0"/>
+          <w:numId w:val="2"/>
+        </w:numPr>
+        <w:spacing w:after="70"/>
+      </w:pPr>
+      <w:r>
+        <w:rPr>
+          <w:rFonts w:ascii="Arial" w:cs="Arial" w:eastAsia="Arial" w:hAnsi="Arial"/>
+          <w:color w:val="111111"/>
+          <w:sz w:val="19"/>
+          <w:szCs w:val="19"/>
+        </w:rPr>
+        <w:t xml:space="preserve">Mentored 2 junior engineers through technical growth plans, resulting in their promotion to Senior roles within 18 months.</w:t>
+      </w:r>
+    </w:p>
+    <w:p>
+      <w:pPr>
+        <w:spacing w:after="50"/>
+      </w:pPr>
+      <w:r>
+        <w:t xml:space="preserve"/>
+      </w:r>
+    </w:p>
+    <w:p>
+      <w:pPr>
+        <w:tabs>
+          <w:tab w:val="right" w:pos="9360"/>
+        </w:tabs>
+        <w:spacing w:after="10" w:before="180"/>
+      </w:pPr>
+      <w:r>
+        <w:rPr>
+          <w:rFonts w:ascii="Arial" w:cs="Arial" w:eastAsia="Arial" w:hAnsi="Arial"/>
+          <w:b/>
+          <w:bCs/>
+          <w:color w:val="111111"/>
+          <w:sz w:val="20"/>
+          <w:szCs w:val="20"/>
+        </w:rPr>
+        <w:t xml:space="preserve">Android Developer</w:t>
+      </w:r>
+      <w:r>
+        <w:rPr>
+          <w:rFonts w:ascii="Arial" w:cs="Arial" w:eastAsia="Arial" w:hAnsi="Arial"/>
+          <w:color w:val="555555"/>
+          <w:sz w:val="18"/>
+          <w:szCs w:val="18"/>
+        </w:rPr>
+        <w:t xml:space="preserve">	Apr 2018 – Aug 2020</w:t>
+      </w:r>
+    </w:p>
+    <w:p>
+      <w:pPr>
+        <w:spacing w:after="90"/>
+      </w:pPr>
+      <w:r>
+        <w:rPr>
+          <w:rFonts w:ascii="Arial" w:cs="Arial" w:eastAsia="Arial" w:hAnsi="Arial"/>
+          <w:i/>
+          <w:iCs/>
+          <w:color w:val="1A5276"/>
+          <w:sz w:val="18"/>
+          <w:szCs w:val="18"/>
+        </w:rPr>
+        <w:t xml:space="preserve">Ready Apps</w:t>
+      </w:r>
+    </w:p>
+    <w:p>
+      <w:pPr>
+        <w:pStyle w:val="ListParagraph"/>
+        <w:numPr>
+          <w:ilvl w:val="0"/>
+          <w:numId w:val="2"/>
+        </w:numPr>
+        <w:spacing w:after="70"/>
+      </w:pPr>
+      <w:r>
+        <w:rPr>
+          <w:rFonts w:ascii="Arial" w:cs="Arial" w:eastAsia="Arial" w:hAnsi="Arial"/>
+          <w:color w:val="111111"/>
+          <w:sz w:val="19"/>
+          <w:szCs w:val="19"/>
+        </w:rPr>
+        <w:t xml:space="preserve">Built a Firebase and Google Maps-based pharmacy locator for 50k+ users, reducing average search time by 50%.</w:t>
+      </w:r>
+    </w:p>
+    <w:p>
+      <w:pPr>
+        <w:pStyle w:val="ListParagraph"/>
+        <w:numPr>
+          <w:ilvl w:val="0"/>
+          <w:numId w:val="2"/>
+        </w:numPr>
+        <w:spacing w:after="70"/>
+      </w:pPr>
+      <w:r>
+        <w:rPr>
+          <w:rFonts w:ascii="Arial" w:cs="Arial" w:eastAsia="Arial" w:hAnsi="Arial"/>
+          <w:color w:val="111111"/>
+          <w:sz w:val="19"/>
+          <w:szCs w:val="19"/>
+        </w:rPr>
+        <w:t xml:space="preserve">Delivered real-time inventory and sales monitoring applications for 100+ locations, reducing manual reporting effort by 60%.</w:t>
+      </w:r>
+    </w:p>
+    <w:p>
+      <w:pPr>
+        <w:pStyle w:val="ListParagraph"/>
+        <w:numPr>
+          <w:ilvl w:val="0"/>
+          <w:numId w:val="2"/>
+        </w:numPr>
+        <w:spacing w:after="70"/>
+      </w:pPr>
+      <w:r>
+        <w:rPr>
+          <w:rFonts w:ascii="Arial" w:cs="Arial" w:eastAsia="Arial" w:hAnsi="Arial"/>
+          <w:color w:val="111111"/>
+          <w:sz w:val="19"/>
+          <w:szCs w:val="19"/>
+        </w:rPr>
+        <w:t xml:space="preserve">Shipped 5+ production applications across health, retail, and logistics domains.</w:t>
+      </w:r>
+    </w:p>
+    <w:p>
+      <w:pPr>
+        <w:spacing w:after="50"/>
+      </w:pPr>
+      <w:r>
+        <w:t xml:space="preserve"/>
+      </w:r>
+    </w:p>
+    <w:p>
+      <w:pPr>
+        <w:tabs>
+          <w:tab w:val="right" w:pos="9360"/>
+        </w:tabs>
+        <w:spacing w:after="10" w:before="180"/>
+      </w:pPr>
+      <w:r>
+        <w:rPr>
+          <w:rFonts w:ascii="Arial" w:cs="Arial" w:eastAsia="Arial" w:hAnsi="Arial"/>
+          <w:b/>
+          <w:bCs/>
+          <w:color w:val="111111"/>
+          <w:sz w:val="20"/>
+          <w:szCs w:val="20"/>
+        </w:rPr>
+        <w:t xml:space="preserve">Android Developer</w:t>
+      </w:r>
+      <w:r>
+        <w:rPr>
+          <w:rFonts w:ascii="Arial" w:cs="Arial" w:eastAsia="Arial" w:hAnsi="Arial"/>
+          <w:color w:val="555555"/>
+          <w:sz w:val="18"/>
+          <w:szCs w:val="18"/>
+        </w:rPr>
+        <w:t xml:space="preserve">	2016 – 2018</w:t>
+      </w:r>
+    </w:p>
+    <w:p>
+      <w:pPr>
+        <w:spacing w:after="90"/>
+      </w:pPr>
+      <w:r>
+        <w:rPr>
+          <w:rFonts w:ascii="Arial" w:cs="Arial" w:eastAsia="Arial" w:hAnsi="Arial"/>
+          <w:i/>
+          <w:iCs/>
+          <w:color w:val="1A5276"/>
+          <w:sz w:val="18"/>
+          <w:szCs w:val="18"/>
+        </w:rPr>
+        <w:t xml:space="preserve">EME International &amp; Pan Arab Media</w:t>
+      </w:r>
+    </w:p>
+    <w:p>
+      <w:pPr>
+        <w:pStyle w:val="ListParagraph"/>
+        <w:numPr>
+          <w:ilvl w:val="0"/>
+          <w:numId w:val="2"/>
+        </w:numPr>
+        <w:spacing w:after="70"/>
+      </w:pPr>
+      <w:r>
+        <w:rPr>
+          <w:rFonts w:ascii="Arial" w:cs="Arial" w:eastAsia="Arial" w:hAnsi="Arial"/>
+          <w:color w:val="111111"/>
+          <w:sz w:val="19"/>
+          <w:szCs w:val="19"/>
+        </w:rPr>
+        <w:t xml:space="preserve">Developed the myFawry eWallet bus reservation module, supporting 10,000+ monthly transactions and hardware printer integration.</w:t>
+      </w:r>
+    </w:p>
+    <w:p>
+      <w:pPr>
+        <w:pStyle w:val="ListParagraph"/>
+        <w:numPr>
+          <w:ilvl w:val="0"/>
+          <w:numId w:val="2"/>
+        </w:numPr>
+        <w:spacing w:after="70"/>
+      </w:pPr>
+      <w:r>
+        <w:rPr>
+          <w:rFonts w:ascii="Arial" w:cs="Arial" w:eastAsia="Arial" w:hAnsi="Arial"/>
+          <w:color w:val="111111"/>
+          <w:sz w:val="19"/>
+          <w:szCs w:val="19"/>
+        </w:rPr>
+        <w:t xml:space="preserve">Managed multi-flavor builds for 3 distinct banking clients to ensure secure and customized deployments.</w:t>
+      </w:r>
+    </w:p>
+    <w:p>
+      <w:pPr>
+        <w:pStyle w:val="ListParagraph"/>
+        <w:numPr>
+          <w:ilvl w:val="0"/>
+          <w:numId w:val="2"/>
+        </w:numPr>
+        <w:spacing w:after="70"/>
+      </w:pPr>
+      <w:r>
+        <w:rPr>
+          <w:rFonts w:ascii="Arial" w:cs="Arial" w:eastAsia="Arial" w:hAnsi="Arial"/>
+          <w:color w:val="111111"/>
+          <w:sz w:val="19"/>
+          <w:szCs w:val="19"/>
+        </w:rPr>
+        <w:t xml:space="preserve">Built an end-to-end e-commerce Android app and an Android TV client using the Leanback library for optimized remote navigation.</w:t>
+      </w:r>
+    </w:p>
+    <w:p>
+      <w:pPr>
+        <w:spacing w:after="50"/>
+      </w:pPr>
+      <w:r>
+        <w:t xml:space="preserve"/>
+      </w:r>
+    </w:p>
+    <w:p>
+      <w:pPr>
+        <w:spacing w:after="60" w:before="200"/>
+      </w:pPr>
+      <w:r>
+        <w:rPr>
+          <w:rFonts w:ascii="Arial" w:cs="Arial" w:eastAsia="Arial" w:hAnsi="Arial"/>
+          <w:b/>
+          <w:bCs/>
+          <w:color w:val="1A5276"/>
+          <w:sz w:val="20"/>
+          <w:szCs w:val="20"/>
+        </w:rPr>
+        <w:t xml:space="preserve">TECHNICAL TOOLING</w:t>
+      </w:r>
+    </w:p>
+    <w:p>
+      <w:pPr>
+        <w:pBdr>
+          <w:bottom w:val="single" w:color="AAAAAA" w:sz="4" w:space="1"/>
+        </w:pBdr>
+        <w:spacing w:after="80" w:before="80"/>
+      </w:pPr>
+    </w:p>
+    <w:p>
+      <w:pPr>
+        <w:spacing w:after="65"/>
+      </w:pPr>
+      <w:r>
+        <w:rPr>
+          <w:rFonts w:ascii="Arial" w:cs="Arial" w:eastAsia="Arial" w:hAnsi="Arial"/>
+          <w:b/>
+          <w:bCs/>
+          <w:color w:val="111111"/>
+          <w:sz w:val="19"/>
+          <w:szCs w:val="19"/>
+        </w:rPr>
+        <w:t xml:space="preserve">Languages: </w:t>
+      </w:r>
+      <w:r>
+        <w:rPr>
+          <w:rFonts w:ascii="Arial" w:cs="Arial" w:eastAsia="Arial" w:hAnsi="Arial"/>
+          <w:color w:val="111111"/>
+          <w:sz w:val="19"/>
+          <w:szCs w:val="19"/>
+        </w:rPr>
+        <w:t xml:space="preserve">Java, Kotlin, Dart, Python</w:t>
+      </w:r>
+    </w:p>
+    <w:p>
+      <w:pPr>
+        <w:spacing w:after="65"/>
+      </w:pPr>
+      <w:r>
+        <w:rPr>
+          <w:rFonts w:ascii="Arial" w:cs="Arial" w:eastAsia="Arial" w:hAnsi="Arial"/>
+          <w:b/>
+          <w:bCs/>
+          <w:color w:val="111111"/>
+          <w:sz w:val="19"/>
+          <w:szCs w:val="19"/>
+        </w:rPr>
+        <w:t xml:space="preserve">Frameworks: </w:t>
+      </w:r>
+      <w:r>
+        <w:rPr>
+          <w:rFonts w:ascii="Arial" w:cs="Arial" w:eastAsia="Arial" w:hAnsi="Arial"/>
+          <w:color w:val="111111"/>
+          <w:sz w:val="19"/>
+          <w:szCs w:val="19"/>
+        </w:rPr>
+        <w:t xml:space="preserve">Android SDK, Jetpack Compose, Spring Boot (Exposure), FastAPI, Node.js</w:t>
+      </w:r>
+    </w:p>
+    <w:p>
+      <w:pPr>
+        <w:spacing w:after="65"/>
+      </w:pPr>
+      <w:r>
+        <w:rPr>
+          <w:rFonts w:ascii="Arial" w:cs="Arial" w:eastAsia="Arial" w:hAnsi="Arial"/>
+          <w:b/>
+          <w:bCs/>
+          <w:color w:val="111111"/>
+          <w:sz w:val="19"/>
+          <w:szCs w:val="19"/>
+        </w:rPr>
+        <w:t xml:space="preserve">Data &amp; Concurrency: </w:t>
+      </w:r>
+      <w:r>
+        <w:rPr>
+          <w:rFonts w:ascii="Arial" w:cs="Arial" w:eastAsia="Arial" w:hAnsi="Arial"/>
+          <w:color w:val="111111"/>
+          <w:sz w:val="19"/>
+          <w:szCs w:val="19"/>
+        </w:rPr>
+        <w:t xml:space="preserve">Coroutines, Flow, RxJava, Room, PostgreSQL, Couchbase, Hilt, Dagger 2</w:t>
+      </w:r>
+    </w:p>
+    <w:p>
+      <w:pPr>
+        <w:spacing w:after="65"/>
+      </w:pPr>
+      <w:r>
+        <w:rPr>
+          <w:rFonts w:ascii="Arial" w:cs="Arial" w:eastAsia="Arial" w:hAnsi="Arial"/>
+          <w:b/>
+          <w:bCs/>
+          <w:color w:val="111111"/>
+          <w:sz w:val="19"/>
+          <w:szCs w:val="19"/>
+        </w:rPr>
+        <w:t xml:space="preserve">Infrastructure: </w:t>
+      </w:r>
+      <w:r>
+        <w:rPr>
+          <w:rFonts w:ascii="Arial" w:cs="Arial" w:eastAsia="Arial" w:hAnsi="Arial"/>
+          <w:color w:val="111111"/>
+          <w:sz w:val="19"/>
+          <w:szCs w:val="19"/>
+        </w:rPr>
+        <w:t xml:space="preserve">Docker, CI/CD, Jenkins, Gradle, Firebase, Git</w:t>
+      </w:r>
+    </w:p>
+    <w:p>
+      <w:pPr>
+        <w:spacing w:after="60"/>
+      </w:pPr>
+      <w:r>
+        <w:t xml:space="preserve"/>
+      </w:r>
+    </w:p>
+    <w:p>
+      <w:pPr>
+        <w:spacing w:after="60" w:before="200"/>
+      </w:pPr>
+      <w:r>
+        <w:rPr>
+          <w:rFonts w:ascii="Arial" w:cs="Arial" w:eastAsia="Arial" w:hAnsi="Arial"/>
+          <w:b/>
+          <w:bCs/>
+          <w:color w:val="1A5276"/>
+          <w:sz w:val="20"/>
+          <w:szCs w:val="20"/>
+        </w:rPr>
+        <w:t xml:space="preserve">EDUCATION &amp; CERTIFICATIONS</w:t>
+      </w:r>
+    </w:p>
+    <w:p>
+      <w:pPr>
+        <w:pBdr>
+          <w:bottom w:val="single" w:color="AAAAAA" w:sz="4" w:space="1"/>
+        </w:pBdr>
+        <w:spacing w:after="80" w:before="80"/>
+      </w:pPr>
+    </w:p>
+    <w:p>
+      <w:pPr>
+        <w:spacing w:after="50"/>
+      </w:pPr>
+      <w:r>
+        <w:rPr>
+          <w:rFonts w:ascii="Arial" w:cs="Arial" w:eastAsia="Arial" w:hAnsi="Arial"/>
+          <w:b/>
+          <w:bCs/>
+          <w:color w:val="111111"/>
+          <w:sz w:val="19"/>
+          <w:szCs w:val="19"/>
+        </w:rPr>
+        <w:t xml:space="preserve">B.Sc. Computer Science — Cairo University (2012 – 2016)</w:t>
+      </w:r>
+    </w:p>
+    <w:p>
+      <w:pPr>
+        <w:pStyle w:val="ListParagraph"/>
+        <w:numPr>
+          <w:ilvl w:val="0"/>
+          <w:numId w:val="2"/>
+        </w:numPr>
+        <w:spacing w:after="70"/>
+      </w:pPr>
+      <w:r>
+        <w:rPr>
+          <w:rFonts w:ascii="Arial" w:cs="Arial" w:eastAsia="Arial" w:hAnsi="Arial"/>
+          <w:color w:val="111111"/>
+          <w:sz w:val="19"/>
+          <w:szCs w:val="19"/>
+        </w:rPr>
+        <w:t xml:space="preserve">Android Developer Nanodegree — Udacity (2017)</w:t>
+      </w:r>
+    </w:p>
+    <w:p>
+      <w:pPr>
+        <w:pStyle w:val="ListParagraph"/>
+        <w:numPr>
+          <w:ilvl w:val="0"/>
+          <w:numId w:val="2"/>
+        </w:numPr>
+        <w:spacing w:after="70"/>
+      </w:pPr>
+      <w:r>
+        <w:rPr>
+          <w:rFonts w:ascii="Arial" w:cs="Arial" w:eastAsia="Arial" w:hAnsi="Arial"/>
+          <w:color w:val="111111"/>
+          <w:sz w:val="19"/>
+          <w:szCs w:val="19"/>
+        </w:rPr>
+        <w:t xml:space="preserve">Mobile Application Launchpad — MCIT &amp; Google via Udacity (2016)</w:t>
       </w:r>
     </w:p>
     <w:sectPr>

</xml_diff>